<commit_message>
feat: implement application logic and Azure Data API Builder integration for hotel management system
</commit_message>
<xml_diff>
--- a/Reports/BaoCao.docx
+++ b/Reports/BaoCao.docx
@@ -9826,15 +9826,12 @@
         <w:keepNext/>
       </w:pPr>
       <w:r>
-        <w:rPr>
-          <w:noProof/>
-        </w:rPr>
         <w:lastRenderedPageBreak/>
         <w:drawing>
-          <wp:inline distT="0" distB="0" distL="0" distR="0" wp14:anchorId="7A8E33FB" wp14:editId="0E494E8A">
-            <wp:extent cx="5582285" cy="1575435"/>
-            <wp:effectExtent l="0" t="0" r="0" b="5715"/>
-            <wp:docPr id="1435926317" name="Hình ảnh 2"/>
+          <wp:inline distT="0" distB="0" distL="0" distR="0" wp14:anchorId="55DA6A76" wp14:editId="323B561D">
+            <wp:extent cx="5582285" cy="2726055"/>
+            <wp:effectExtent l="0" t="0" r="0" b="0"/>
+            <wp:docPr id="938447532" name="Hình ảnh 1"/>
             <wp:cNvGraphicFramePr>
               <a:graphicFrameLocks xmlns:a="http://schemas.openxmlformats.org/drawingml/2006/main" noChangeAspect="1"/>
             </wp:cNvGraphicFramePr>
@@ -9842,17 +9839,11 @@
               <a:graphicData uri="http://schemas.openxmlformats.org/drawingml/2006/picture">
                 <pic:pic xmlns:pic="http://schemas.openxmlformats.org/drawingml/2006/picture">
                   <pic:nvPicPr>
-                    <pic:cNvPr id="1435926317" name="Hình ảnh 1435926317"/>
+                    <pic:cNvPr id="938447532" name=""/>
                     <pic:cNvPicPr/>
                   </pic:nvPicPr>
                   <pic:blipFill>
-                    <a:blip r:embed="rId31" cstate="print">
-                      <a:extLst>
-                        <a:ext uri="{28A0092B-C50C-407E-A947-70E740481C1C}">
-                          <a14:useLocalDpi xmlns:a14="http://schemas.microsoft.com/office/drawing/2010/main" val="0"/>
-                        </a:ext>
-                      </a:extLst>
-                    </a:blip>
+                    <a:blip r:embed="rId31"/>
                     <a:stretch>
                       <a:fillRect/>
                     </a:stretch>
@@ -9860,7 +9851,7 @@
                   <pic:spPr>
                     <a:xfrm>
                       <a:off x="0" y="0"/>
-                      <a:ext cx="5582285" cy="1575435"/>
+                      <a:ext cx="5582285" cy="2726055"/>
                     </a:xfrm>
                     <a:prstGeom prst="rect">
                       <a:avLst/>
@@ -10027,6 +10018,7 @@
     <w:tbl>
       <w:tblPr>
         <w:tblW w:w="0" w:type="auto"/>
+        <w:tblInd w:w="-365" w:type="dxa"/>
         <w:tblBorders>
           <w:top w:val="single" w:sz="4" w:space="0" w:color="auto"/>
           <w:left w:val="single" w:sz="4" w:space="0" w:color="auto"/>
@@ -10044,9 +10036,9 @@
         <w:tblLook w:val="04A0" w:firstRow="1" w:lastRow="0" w:firstColumn="1" w:lastColumn="0" w:noHBand="0" w:noVBand="1"/>
       </w:tblPr>
       <w:tblGrid>
-        <w:gridCol w:w="1843"/>
-        <w:gridCol w:w="3493"/>
-        <w:gridCol w:w="3445"/>
+        <w:gridCol w:w="2333"/>
+        <w:gridCol w:w="3380"/>
+        <w:gridCol w:w="3433"/>
       </w:tblGrid>
       <w:tr>
         <w:trPr>
@@ -10054,7 +10046,7 @@
         </w:trPr>
         <w:tc>
           <w:tcPr>
-            <w:tcW w:w="0" w:type="auto"/>
+            <w:tcW w:w="2333" w:type="dxa"/>
             <w:shd w:val="clear" w:color="auto" w:fill="17365D" w:themeFill="text2" w:themeFillShade="BF"/>
             <w:tcMar>
               <w:top w:w="75" w:type="dxa"/>
@@ -10071,7 +10063,6 @@
               <w:rPr>
                 <w:b/>
                 <w:bCs/>
-                <w:color w:val="FFFFFF" w:themeColor="background1"/>
                 <w:lang w:val="en-US"/>
               </w:rPr>
             </w:pPr>
@@ -10079,10 +10070,9 @@
               <w:rPr>
                 <w:b/>
                 <w:bCs/>
-                <w:color w:val="FFFFFF" w:themeColor="background1"/>
-                <w:lang w:val="en-US"/>
-              </w:rPr>
-              <w:t>Tiêu chí</w:t>
+                <w:lang w:val="en-US"/>
+              </w:rPr>
+              <w:t>Tiêu chí so sánh</w:t>
             </w:r>
           </w:p>
         </w:tc>
@@ -10105,7 +10095,6 @@
               <w:rPr>
                 <w:b/>
                 <w:bCs/>
-                <w:color w:val="FFFFFF" w:themeColor="background1"/>
                 <w:lang w:val="en-US"/>
               </w:rPr>
             </w:pPr>
@@ -10113,10 +10102,9 @@
               <w:rPr>
                 <w:b/>
                 <w:bCs/>
-                <w:color w:val="FFFFFF" w:themeColor="background1"/>
-                <w:lang w:val="en-US"/>
-              </w:rPr>
-              <w:t xml:space="preserve">Microsoft Power Apps </w:t>
+                <w:lang w:val="en-US"/>
+              </w:rPr>
+              <w:t xml:space="preserve">Azure Data API Builder + Web App </w:t>
             </w:r>
           </w:p>
         </w:tc>
@@ -10139,7 +10127,6 @@
               <w:rPr>
                 <w:b/>
                 <w:bCs/>
-                <w:color w:val="FFFFFF" w:themeColor="background1"/>
                 <w:lang w:val="en-US"/>
               </w:rPr>
             </w:pPr>
@@ -10147,10 +10134,9 @@
               <w:rPr>
                 <w:b/>
                 <w:bCs/>
-                <w:color w:val="FFFFFF" w:themeColor="background1"/>
-                <w:lang w:val="en-US"/>
-              </w:rPr>
-              <w:t xml:space="preserve">FastAPI + Custom Web </w:t>
+                <w:lang w:val="en-US"/>
+              </w:rPr>
+              <w:t>Microsoft Power Apps</w:t>
             </w:r>
           </w:p>
         </w:tc>
@@ -10158,7 +10144,7 @@
       <w:tr>
         <w:tc>
           <w:tcPr>
-            <w:tcW w:w="0" w:type="auto"/>
+            <w:tcW w:w="2333" w:type="dxa"/>
             <w:tcMar>
               <w:top w:w="75" w:type="dxa"/>
               <w:left w:w="150" w:type="dxa"/>
@@ -10181,7 +10167,7 @@
                 <w:bCs/>
                 <w:lang w:val="en-US"/>
               </w:rPr>
-              <w:t>Thời gian làm CRUD App</w:t>
+              <w:t>Thời gian xây dựng CRUD</w:t>
             </w:r>
           </w:p>
         </w:tc>
@@ -10206,9 +10192,17 @@
             </w:pPr>
             <w:r>
               <w:rPr>
-                <w:lang w:val="en-US"/>
-              </w:rPr>
-              <w:t>1–3 ngày (Tự sinh form CRUD, kéo thả)</w:t>
+                <w:b/>
+                <w:bCs/>
+                <w:lang w:val="en-US"/>
+              </w:rPr>
+              <w:t>1–2 ngày:</w:t>
+            </w:r>
+            <w:r>
+              <w:rPr>
+                <w:lang w:val="en-US"/>
+              </w:rPr>
+              <w:t> Tự động sinh REST API qua cấu hình dab-config.json, tích hợp ngay vào Web App.</w:t>
             </w:r>
           </w:p>
         </w:tc>
@@ -10233,9 +10227,17 @@
             </w:pPr>
             <w:r>
               <w:rPr>
-                <w:lang w:val="en-US"/>
-              </w:rPr>
-              <w:t>3–4 tuần (Tự code API, HTML/CSS, Auth)</w:t>
+                <w:b/>
+                <w:bCs/>
+                <w:lang w:val="en-US"/>
+              </w:rPr>
+              <w:t>1–3 ngày:</w:t>
+            </w:r>
+            <w:r>
+              <w:rPr>
+                <w:lang w:val="en-US"/>
+              </w:rPr>
+              <w:t> Tự sinh form CRUD kéo thả trực quan.</w:t>
             </w:r>
           </w:p>
         </w:tc>
@@ -10243,7 +10245,7 @@
       <w:tr>
         <w:tc>
           <w:tcPr>
-            <w:tcW w:w="0" w:type="auto"/>
+            <w:tcW w:w="2333" w:type="dxa"/>
             <w:tcMar>
               <w:top w:w="75" w:type="dxa"/>
               <w:left w:w="150" w:type="dxa"/>
@@ -10266,7 +10268,7 @@
                 <w:bCs/>
                 <w:lang w:val="en-US"/>
               </w:rPr>
-              <w:t>Giao diện Buồng phòng</w:t>
+              <w:t>Khả năng tùy biến giao diện (UI/UX)</w:t>
             </w:r>
           </w:p>
         </w:tc>
@@ -10291,9 +10293,17 @@
             </w:pPr>
             <w:r>
               <w:rPr>
-                <w:lang w:val="en-US"/>
-              </w:rPr>
-              <w:t>Tích hợp sẵn chung 1 màn hình đơn giản</w:t>
+                <w:b/>
+                <w:bCs/>
+                <w:lang w:val="en-US"/>
+              </w:rPr>
+              <w:t>Tối đa (100%):</w:t>
+            </w:r>
+            <w:r>
+              <w:rPr>
+                <w:lang w:val="en-US"/>
+              </w:rPr>
+              <w:t> Tự do thiết kế giao diện Ma trận phòng, Check-in nhanh tối ưu riêng cho Lễ tân và Buồng phòng.</w:t>
             </w:r>
           </w:p>
         </w:tc>
@@ -10318,9 +10328,17 @@
             </w:pPr>
             <w:r>
               <w:rPr>
-                <w:lang w:val="en-US"/>
-              </w:rPr>
-              <w:t>Phải tự viết thêm giao diện riêng</w:t>
+                <w:b/>
+                <w:bCs/>
+                <w:lang w:val="en-US"/>
+              </w:rPr>
+              <w:t>Bị giới hạn:</w:t>
+            </w:r>
+            <w:r>
+              <w:rPr>
+                <w:lang w:val="en-US"/>
+              </w:rPr>
+              <w:t> Phụ thuộc vào khung mẫu Canvas/Model-driven App, khó tùy biến bố cục ma trận chuyên biệt.</w:t>
             </w:r>
           </w:p>
         </w:tc>
@@ -10328,7 +10346,7 @@
       <w:tr>
         <w:tc>
           <w:tcPr>
-            <w:tcW w:w="0" w:type="auto"/>
+            <w:tcW w:w="2333" w:type="dxa"/>
             <w:tcMar>
               <w:top w:w="75" w:type="dxa"/>
               <w:left w:w="150" w:type="dxa"/>
@@ -10351,7 +10369,7 @@
                 <w:bCs/>
                 <w:lang w:val="en-US"/>
               </w:rPr>
-              <w:t>Độ đồng bộ Cloud</w:t>
+              <w:t>Gọi Views &amp; Stored Procedures</w:t>
             </w:r>
           </w:p>
         </w:tc>
@@ -10376,9 +10394,24 @@
             </w:pPr>
             <w:r>
               <w:rPr>
-                <w:lang w:val="en-US"/>
-              </w:rPr>
-              <w:t>Native 100% với Azure SQL &amp; Power BI</w:t>
+                <w:b/>
+                <w:bCs/>
+                <w:lang w:val="en-US"/>
+              </w:rPr>
+              <w:t>Tương thích tuyệt đối (100%):</w:t>
+            </w:r>
+            <w:r>
+              <w:rPr>
+                <w:lang w:val="en-US"/>
+              </w:rPr>
+              <w:t xml:space="preserve"> Ánh xạ trực tiếp View ma trận phòng và gọi </w:t>
+            </w:r>
+            <w:r>
+              <w:rPr>
+                <w:lang w:val="en-US"/>
+              </w:rPr>
+              <w:lastRenderedPageBreak/>
+              <w:t>Stored Procedures bằng POST request tức thì.</w:t>
             </w:r>
           </w:p>
         </w:tc>
@@ -10403,9 +10436,25 @@
             </w:pPr>
             <w:r>
               <w:rPr>
-                <w:lang w:val="en-US"/>
-              </w:rPr>
-              <w:t>Phải code model ORM và API trung gian</w:t>
+                <w:b/>
+                <w:bCs/>
+                <w:lang w:val="en-US"/>
+              </w:rPr>
+              <w:lastRenderedPageBreak/>
+              <w:t>Phức tạp hơn:</w:t>
+            </w:r>
+            <w:r>
+              <w:rPr>
+                <w:lang w:val="en-US"/>
+              </w:rPr>
+              <w:t xml:space="preserve"> Kết nối tốt với Table nhưng gọi Stored Procedures phải thông qua </w:t>
+            </w:r>
+            <w:r>
+              <w:rPr>
+                <w:lang w:val="en-US"/>
+              </w:rPr>
+              <w:lastRenderedPageBreak/>
+              <w:t>luồng Power Automate trung gian.</w:t>
             </w:r>
           </w:p>
         </w:tc>
@@ -10413,7 +10462,7 @@
       <w:tr>
         <w:tc>
           <w:tcPr>
-            <w:tcW w:w="0" w:type="auto"/>
+            <w:tcW w:w="2333" w:type="dxa"/>
             <w:tcMar>
               <w:top w:w="75" w:type="dxa"/>
               <w:left w:w="150" w:type="dxa"/>
@@ -10436,6 +10485,7 @@
                 <w:bCs/>
                 <w:lang w:val="en-US"/>
               </w:rPr>
+              <w:lastRenderedPageBreak/>
               <w:t>Độ khó bảo trì &amp; sửa đổi</w:t>
             </w:r>
           </w:p>
@@ -10461,9 +10511,17 @@
             </w:pPr>
             <w:r>
               <w:rPr>
-                <w:lang w:val="en-US"/>
-              </w:rPr>
-              <w:t>Dễ dàng (Tự chỉnh sửa form trực quan)</w:t>
+                <w:b/>
+                <w:bCs/>
+                <w:lang w:val="en-US"/>
+              </w:rPr>
+              <w:t>Rất dễ:</w:t>
+            </w:r>
+            <w:r>
+              <w:rPr>
+                <w:lang w:val="en-US"/>
+              </w:rPr>
+              <w:t> Khi CSDL thay đổi, chỉ cần cập nhật file cấu hình JSON, không cần can thiệp mã nguồn backend.</w:t>
             </w:r>
           </w:p>
         </w:tc>
@@ -10488,187 +10546,17 @@
             </w:pPr>
             <w:r>
               <w:rPr>
-                <w:lang w:val="en-US"/>
-              </w:rPr>
-              <w:t>Phức tạp (Cần lập trình viên chuyên môn)</w:t>
-            </w:r>
-          </w:p>
-        </w:tc>
-      </w:tr>
-      <w:tr>
-        <w:tc>
-          <w:tcPr>
-            <w:tcW w:w="0" w:type="auto"/>
-            <w:tcMar>
-              <w:top w:w="75" w:type="dxa"/>
-              <w:left w:w="150" w:type="dxa"/>
-              <w:bottom w:w="75" w:type="dxa"/>
-              <w:right w:w="150" w:type="dxa"/>
-            </w:tcMar>
-            <w:vAlign w:val="center"/>
-            <w:hideMark/>
-          </w:tcPr>
-          <w:p>
-            <w:pPr>
-              <w:jc w:val="left"/>
-              <w:rPr>
-                <w:lang w:val="en-US"/>
-              </w:rPr>
-            </w:pPr>
-            <w:r>
-              <w:rPr>
                 <w:b/>
                 <w:bCs/>
                 <w:lang w:val="en-US"/>
               </w:rPr>
-              <w:t xml:space="preserve">Tính phù hợp đề tài </w:t>
-            </w:r>
-            <w:r>
-              <w:rPr>
-                <w:b/>
-                <w:bCs/>
-                <w:lang w:val="en-US"/>
-              </w:rPr>
-              <w:t>chuyển dổi số</w:t>
-            </w:r>
-          </w:p>
-        </w:tc>
-        <w:tc>
-          <w:tcPr>
-            <w:tcW w:w="0" w:type="auto"/>
-            <w:tcMar>
-              <w:top w:w="75" w:type="dxa"/>
-              <w:left w:w="150" w:type="dxa"/>
-              <w:bottom w:w="75" w:type="dxa"/>
-              <w:right w:w="150" w:type="dxa"/>
-            </w:tcMar>
-            <w:vAlign w:val="center"/>
-            <w:hideMark/>
-          </w:tcPr>
-          <w:p>
-            <w:pPr>
-              <w:jc w:val="left"/>
-              <w:rPr>
-                <w:lang w:val="en-US"/>
-              </w:rPr>
-            </w:pPr>
-            <w:r>
-              <w:rPr>
-                <w:lang w:val="en-US"/>
-              </w:rPr>
-              <w:t>Rất cao: Tập trung trực diện vào chuẩn hóa quy trình vận hành và luồng dữ liệu kinh doanh</w:t>
-            </w:r>
-          </w:p>
-        </w:tc>
-        <w:tc>
-          <w:tcPr>
-            <w:tcW w:w="0" w:type="auto"/>
-            <w:tcMar>
-              <w:top w:w="75" w:type="dxa"/>
-              <w:left w:w="150" w:type="dxa"/>
-              <w:bottom w:w="75" w:type="dxa"/>
-              <w:right w:w="150" w:type="dxa"/>
-            </w:tcMar>
-            <w:vAlign w:val="center"/>
-            <w:hideMark/>
-          </w:tcPr>
-          <w:p>
-            <w:pPr>
-              <w:jc w:val="left"/>
-              <w:rPr>
-                <w:lang w:val="en-US"/>
-              </w:rPr>
-            </w:pPr>
-            <w:r>
-              <w:rPr>
-                <w:lang w:val="en-US"/>
-              </w:rPr>
-              <w:t>Chưa tối ưu: Mất 80% thời gian vào viết code kỹ thuật thay vì tập trung nghiệp vụ</w:t>
-            </w:r>
-          </w:p>
-        </w:tc>
-      </w:tr>
-      <w:tr>
-        <w:tc>
-          <w:tcPr>
-            <w:tcW w:w="0" w:type="auto"/>
-            <w:tcMar>
-              <w:top w:w="75" w:type="dxa"/>
-              <w:left w:w="150" w:type="dxa"/>
-              <w:bottom w:w="75" w:type="dxa"/>
-              <w:right w:w="150" w:type="dxa"/>
-            </w:tcMar>
-            <w:vAlign w:val="center"/>
-            <w:hideMark/>
-          </w:tcPr>
-          <w:p>
-            <w:pPr>
-              <w:jc w:val="left"/>
-              <w:rPr>
-                <w:lang w:val="en-US"/>
-              </w:rPr>
-            </w:pPr>
-            <w:r>
-              <w:rPr>
-                <w:b/>
-                <w:bCs/>
-                <w:lang w:val="en-US"/>
-              </w:rPr>
-              <w:t>Chi phí MVP</w:t>
-            </w:r>
-          </w:p>
-        </w:tc>
-        <w:tc>
-          <w:tcPr>
-            <w:tcW w:w="0" w:type="auto"/>
-            <w:tcMar>
-              <w:top w:w="75" w:type="dxa"/>
-              <w:left w:w="150" w:type="dxa"/>
-              <w:bottom w:w="75" w:type="dxa"/>
-              <w:right w:w="150" w:type="dxa"/>
-            </w:tcMar>
-            <w:vAlign w:val="center"/>
-            <w:hideMark/>
-          </w:tcPr>
-          <w:p>
-            <w:pPr>
-              <w:jc w:val="left"/>
-              <w:rPr>
-                <w:lang w:val="en-US"/>
-              </w:rPr>
-            </w:pPr>
-            <w:r>
-              <w:rPr>
-                <w:lang w:val="en-US"/>
-              </w:rPr>
-              <w:t>$0 (Power Apps Developer Plan)</w:t>
-            </w:r>
-          </w:p>
-        </w:tc>
-        <w:tc>
-          <w:tcPr>
-            <w:tcW w:w="0" w:type="auto"/>
-            <w:tcMar>
-              <w:top w:w="75" w:type="dxa"/>
-              <w:left w:w="150" w:type="dxa"/>
-              <w:bottom w:w="75" w:type="dxa"/>
-              <w:right w:w="150" w:type="dxa"/>
-            </w:tcMar>
-            <w:vAlign w:val="center"/>
-            <w:hideMark/>
-          </w:tcPr>
-          <w:p>
-            <w:pPr>
-              <w:jc w:val="left"/>
-              <w:rPr>
-                <w:lang w:val="en-US"/>
-              </w:rPr>
-            </w:pPr>
-            <w:r>
-              <w:rPr>
-                <w:lang w:val="en-US"/>
-              </w:rPr>
-              <w:t>$0 (Mã nguồn mở)</w:t>
+              <w:t>Dễ dàng:</w:t>
+            </w:r>
+            <w:r>
+              <w:rPr>
+                <w:lang w:val="en-US"/>
+              </w:rPr>
+              <w:t> Chỉnh sửa các form và luồng dữ liệu kéo thả trực quan.</w:t>
             </w:r>
           </w:p>
         </w:tc>
@@ -10680,36 +10568,29 @@
           <w:lang w:val="en-US"/>
         </w:rPr>
       </w:pPr>
+      <w:r>
+        <w:rPr>
+          <w:b/>
+          <w:bCs/>
+        </w:rPr>
+        <w:t>Quyết định lựa chọn</w:t>
+      </w:r>
+      <w:r>
+        <w:t>: Chọn Azure Data API Builder kết hợp Web App để đảm bảo tốc độ tạo CRUD siêu tốc, tự do tùy biến giao diện trực quan cho Lễ tân &amp; Buồng phòng.</w:t>
+      </w:r>
     </w:p>
     <w:p>
       <w:pPr>
-        <w:rPr>
-          <w:lang w:val="en-US"/>
-        </w:rPr>
-      </w:pPr>
-      <w:r>
-        <w:rPr>
-          <w:lang w:val="en-US"/>
-        </w:rPr>
-        <w:lastRenderedPageBreak/>
-        <w:t xml:space="preserve">Quyết định lựa chọn: Chọn Microsoft Power Apps để tối ưu hóa thời gian phát triển, thống nhất giao diện thao tác cho lễ tân và buồng phòng, loại bỏ gánh nặng bảo trì </w:t>
-      </w:r>
-      <w:r>
-        <w:rPr>
-          <w:lang w:val="en-US"/>
-        </w:rPr>
-        <w:t>mà nguồn.</w:t>
-      </w:r>
-    </w:p>
-    <w:p>
-      <w:pPr>
         <w:pStyle w:val="u3"/>
       </w:pPr>
       <w:bookmarkStart w:id="41" w:name="_Toc239934543"/>
       <w:r>
-        <w:t>Đánh giá khả năng đáp ứng của gói Power Apps Developer Plan</w:t>
+        <w:t xml:space="preserve">Đánh giá khả năng đáp ứng của </w:t>
       </w:r>
       <w:bookmarkEnd w:id="41"/>
+      <w:r>
+        <w:t>Azure Data API Builder</w:t>
+      </w:r>
     </w:p>
     <w:p>
       <w:pPr>
@@ -10791,10 +10672,10 @@
         <w:tblLook w:val="04A0" w:firstRow="1" w:lastRow="0" w:firstColumn="1" w:lastColumn="0" w:noHBand="0" w:noVBand="1"/>
       </w:tblPr>
       <w:tblGrid>
-        <w:gridCol w:w="2358"/>
-        <w:gridCol w:w="2214"/>
-        <w:gridCol w:w="2332"/>
-        <w:gridCol w:w="1877"/>
+        <w:gridCol w:w="2401"/>
+        <w:gridCol w:w="2114"/>
+        <w:gridCol w:w="2373"/>
+        <w:gridCol w:w="1893"/>
       </w:tblGrid>
       <w:tr>
         <w:trPr>
@@ -10892,7 +10773,7 @@
                 <w:bCs/>
                 <w:lang w:val="en-US"/>
               </w:rPr>
-              <w:t>Giới hạn gói miễn phí (Developer Plan)</w:t>
+              <w:t>Hạn mức miễn phí Azure Container Apps (ACA Free Tier)</w:t>
             </w:r>
           </w:p>
         </w:tc>
@@ -10955,7 +10836,7 @@
                 <w:bCs/>
                 <w:lang w:val="en-US"/>
               </w:rPr>
-              <w:t>Số lượt thao tác trên App mỗi ngày</w:t>
+              <w:t>Số lượng Request API / ngày</w:t>
             </w:r>
             <w:r>
               <w:rPr>
@@ -10969,7 +10850,7 @@
                 <w:iCs/>
                 <w:lang w:val="en-US"/>
               </w:rPr>
-              <w:t>(Bấm Check-in, đổi phòng, dọn phòng)</w:t>
+              <w:t>(Check-in, đổi phòng, dọn phòng, xem ma trận)</w:t>
             </w:r>
           </w:p>
         </w:tc>
@@ -10996,15 +10877,7 @@
               <w:rPr>
                 <w:lang w:val="en-US"/>
               </w:rPr>
-              <w:t>Khoảng 100 – 200 lượt / ngày </w:t>
-            </w:r>
-            <w:r>
-              <w:rPr>
-                <w:i/>
-                <w:iCs/>
-                <w:lang w:val="en-US"/>
-              </w:rPr>
-              <w:t>(Mỗi khách check-in/out tạo vài thao tác)</w:t>
+              <w:t>200 – 500 lượt gọi API / ngày</w:t>
             </w:r>
           </w:p>
         </w:tc>
@@ -11031,15 +10904,7 @@
               <w:rPr>
                 <w:lang w:val="en-US"/>
               </w:rPr>
-              <w:t>6.000 lượt thao tác / ngày </w:t>
-            </w:r>
-            <w:r>
-              <w:rPr>
-                <w:i/>
-                <w:iCs/>
-                <w:lang w:val="en-US"/>
-              </w:rPr>
-              <w:t>(Mức trần của Microsoft)</w:t>
+              <w:t>Hỗ trợ hàng triệu request / tháng</w:t>
             </w:r>
           </w:p>
         </w:tc>
@@ -11066,7 +10931,7 @@
               <w:rPr>
                 <w:lang w:val="en-US"/>
               </w:rPr>
-              <w:t>Chỉ dùng ~3% </w:t>
+              <w:t>Sử dụng &lt; 0.1% </w:t>
             </w:r>
             <w:r>
               <w:rPr>
@@ -11074,7 +10939,7 @@
                 <w:iCs/>
                 <w:lang w:val="en-US"/>
               </w:rPr>
-              <w:t>(Dư dả hơn 97%, không sợ nghẽn app)</w:t>
+              <w:t>(Dư dả &gt; 99.9%, phản hồi tức thì)</w:t>
             </w:r>
           </w:p>
         </w:tc>
@@ -11105,7 +10970,7 @@
                 <w:bCs/>
                 <w:lang w:val="en-US"/>
               </w:rPr>
-              <w:t>Thời hạn sử dụng</w:t>
+              <w:t>Thời gian tính toán máy chủ (vCPU Compute)</w:t>
             </w:r>
           </w:p>
         </w:tc>
@@ -11132,7 +10997,15 @@
               <w:rPr>
                 <w:lang w:val="en-US"/>
               </w:rPr>
-              <w:t>Phục vụ toàn bộ quá trình làm đồ án &amp; thử nghiệm</w:t>
+              <w:t>~50 – 100 vCPU-seconds / ngày </w:t>
+            </w:r>
+            <w:r>
+              <w:rPr>
+                <w:i/>
+                <w:iCs/>
+                <w:lang w:val="en-US"/>
+              </w:rPr>
+              <w:t>(Thời gian xử lý mỗi request chỉ 15–30ms)</w:t>
             </w:r>
           </w:p>
         </w:tc>
@@ -11159,7 +11032,7 @@
               <w:rPr>
                 <w:lang w:val="en-US"/>
               </w:rPr>
-              <w:t>Miễn phí vĩnh viễn ($0) </w:t>
+              <w:t>180.000 vCPU-seconds / tháng </w:t>
             </w:r>
             <w:r>
               <w:rPr>
@@ -11167,7 +11040,16 @@
                 <w:iCs/>
                 <w:lang w:val="en-US"/>
               </w:rPr>
-              <w:t>(Không bị khóa sau 30/60 ngày)</w:t>
+              <w:t xml:space="preserve">(Tương đương ~6.000 vCPU-seconds / </w:t>
+            </w:r>
+            <w:r>
+              <w:rPr>
+                <w:i/>
+                <w:iCs/>
+                <w:lang w:val="en-US"/>
+              </w:rPr>
+              <w:lastRenderedPageBreak/>
+              <w:t>ngày)</w:t>
             </w:r>
           </w:p>
         </w:tc>
@@ -11194,7 +11076,16 @@
               <w:rPr>
                 <w:lang w:val="en-US"/>
               </w:rPr>
-              <w:t>An tâm tuyệt đối</w:t>
+              <w:lastRenderedPageBreak/>
+              <w:t>Chỉ dùng ~1.2% quota miễn phí </w:t>
+            </w:r>
+            <w:r>
+              <w:rPr>
+                <w:i/>
+                <w:iCs/>
+                <w:lang w:val="en-US"/>
+              </w:rPr>
+              <w:t>(Hoàn toàn $0 chi phí)</w:t>
             </w:r>
           </w:p>
         </w:tc>
@@ -11225,7 +11116,8 @@
                 <w:bCs/>
                 <w:lang w:val="en-US"/>
               </w:rPr>
-              <w:t>Quyền kết nối CSDL Azure SQL</w:t>
+              <w:lastRenderedPageBreak/>
+              <w:t>Dung lượng bộ nhớ Container (RAM)</w:t>
             </w:r>
           </w:p>
         </w:tc>
@@ -11252,7 +11144,7 @@
               <w:rPr>
                 <w:lang w:val="en-US"/>
               </w:rPr>
-              <w:t>Cần kết nối trực tiếp lên cơ sở dữ liệu Cloud</w:t>
+              <w:t>DAB Engine tiêu tốn ~120 – 200 MB RAM</w:t>
             </w:r>
           </w:p>
         </w:tc>
@@ -11279,15 +11171,7 @@
               <w:rPr>
                 <w:lang w:val="en-US"/>
               </w:rPr>
-              <w:t>Được mở khóa 100% </w:t>
-            </w:r>
-            <w:r>
-              <w:rPr>
-                <w:i/>
-                <w:iCs/>
-                <w:lang w:val="en-US"/>
-              </w:rPr>
-              <w:t>(Không bắt buộc mua gói trả phí)</w:t>
+              <w:t>360.000 GiB-seconds / tháng (Cấp phát 0.5 GiB RAM)</w:t>
             </w:r>
           </w:p>
         </w:tc>
@@ -11314,7 +11198,7 @@
               <w:rPr>
                 <w:lang w:val="en-US"/>
               </w:rPr>
-              <w:t>Kết nối mượt mà</w:t>
+              <w:t>Chỉ chiếm ~30% mức cấp phát tối thiểu, chạy cực kỳ ổn định</w:t>
             </w:r>
           </w:p>
         </w:tc>
@@ -11338,7 +11222,7 @@
         <w:pStyle w:val="oancuaDanhsach"/>
         <w:numPr>
           <w:ilvl w:val="0"/>
-          <w:numId w:val="29"/>
+          <w:numId w:val="33"/>
         </w:numPr>
         <w:rPr>
           <w:lang w:val="en-US"/>
@@ -11346,9 +11230,15 @@
       </w:pPr>
       <w:r>
         <w:rPr>
-          <w:lang w:val="en-US"/>
-        </w:rPr>
-        <w:t>Không lo quá tải: Khách sạn 20 phòng chỉ phát sinh khoảng 100-200 lượt bấm/ngày, cách rất xa mức giới hạn 6000 lượt/ ngày của Microsoft.</w:t>
+          <w:rStyle w:val="Nhnmanh"/>
+          <w:i w:val="0"/>
+          <w:iCs w:val="0"/>
+          <w:szCs w:val="26"/>
+        </w:rPr>
+        <w:t>Không lo quá tải:</w:t>
+      </w:r>
+      <w:r>
+        <w:t> Xử lý mượt mà 200–500 request/ngày, phản hồi cực nhanh (&lt; 30ms), chỉ dùng ~1.2% quota miễn phí của Azure.</w:t>
       </w:r>
     </w:p>
     <w:p>
@@ -11356,50 +11246,34 @@
         <w:pStyle w:val="oancuaDanhsach"/>
         <w:numPr>
           <w:ilvl w:val="0"/>
-          <w:numId w:val="29"/>
+          <w:numId w:val="33"/>
         </w:numPr>
-        <w:rPr>
-          <w:lang w:val="en-US"/>
-        </w:rPr>
-      </w:pPr>
-      <w:r>
-        <w:rPr>
-          <w:lang w:val="en-US"/>
-        </w:rPr>
-        <w:t>Không lo hết hạn: Gói Developer Plan được duy trì miễn phí trọng đời cho môi trường học tập/ nghiên cứu.</w:t>
+      </w:pPr>
+      <w:bookmarkStart w:id="43" w:name="_Toc239934544"/>
+      <w:r>
+        <w:rPr>
+          <w:rStyle w:val="Nhnmanh"/>
+          <w:i w:val="0"/>
+          <w:iCs w:val="0"/>
+          <w:szCs w:val="26"/>
+        </w:rPr>
+        <w:t>Không tốn công bảo trì:</w:t>
+      </w:r>
+      <w:r>
+        <w:t> Tự động sinh API qua file cấu hình JSON, loại bỏ 100% việc viết mã backend.</w:t>
       </w:r>
     </w:p>
     <w:p>
       <w:pPr>
-        <w:pStyle w:val="oancuaDanhsach"/>
-        <w:numPr>
-          <w:ilvl w:val="0"/>
-          <w:numId w:val="29"/>
-        </w:numPr>
-        <w:rPr>
-          <w:lang w:val="en-US"/>
-        </w:rPr>
-      </w:pPr>
-      <w:r>
-        <w:rPr>
-          <w:lang w:val="en-US"/>
-        </w:rPr>
-        <w:t>Đầy đủ tính năng: Hỗ trợ kết nối trực tiếp vào Azure SQL Database mà không bị rào cản bản quyền</w:t>
-      </w:r>
-    </w:p>
-    <w:p>
-      <w:pPr>
         <w:pStyle w:val="u2"/>
         <w:rPr>
           <w:lang w:val="en-US"/>
         </w:rPr>
       </w:pPr>
-      <w:bookmarkStart w:id="43" w:name="_Toc239934544"/>
-      <w:r>
-        <w:rPr>
-          <w:lang w:val="en-US"/>
-        </w:rPr>
-        <w:lastRenderedPageBreak/>
+      <w:r>
+        <w:rPr>
+          <w:lang w:val="en-US"/>
+        </w:rPr>
         <w:t>Đánh giá và so sánh các nền tảng xây dựng cơ sở dữ liệu</w:t>
       </w:r>
       <w:bookmarkEnd w:id="43"/>
@@ -11726,7 +11600,16 @@
                 <w:bCs/>
                 <w:lang w:val="en-US"/>
               </w:rPr>
-              <w:t>Tính liên tục khi hoạt động (Không bị tắt)</w:t>
+              <w:t xml:space="preserve">Tính liên tục </w:t>
+            </w:r>
+            <w:r>
+              <w:rPr>
+                <w:b/>
+                <w:bCs/>
+                <w:lang w:val="en-US"/>
+              </w:rPr>
+              <w:lastRenderedPageBreak/>
+              <w:t>khi hoạt động (Không bị tắt)</w:t>
             </w:r>
           </w:p>
         </w:tc>
@@ -11755,13 +11638,21 @@
                 <w:bCs/>
                 <w:lang w:val="en-US"/>
               </w:rPr>
+              <w:lastRenderedPageBreak/>
               <w:t>Hoạt động ổn định 24/7:</w:t>
             </w:r>
             <w:r>
               <w:rPr>
                 <w:lang w:val="en-US"/>
               </w:rPr>
-              <w:t> Duy trì miễn phí liên tục, không bao giờ bị hệ thống tự động khóa hay tạm dừng.</w:t>
+              <w:t xml:space="preserve"> Duy </w:t>
+            </w:r>
+            <w:r>
+              <w:rPr>
+                <w:lang w:val="en-US"/>
+              </w:rPr>
+              <w:lastRenderedPageBreak/>
+              <w:t>trì miễn phí liên tục, không bao giờ bị hệ thống tự động khóa hay tạm dừng.</w:t>
             </w:r>
           </w:p>
         </w:tc>
@@ -11790,13 +11681,21 @@
                 <w:bCs/>
                 <w:lang w:val="en-US"/>
               </w:rPr>
+              <w:lastRenderedPageBreak/>
               <w:t>Dễ bị gián đoạn:</w:t>
             </w:r>
             <w:r>
               <w:rPr>
                 <w:lang w:val="en-US"/>
               </w:rPr>
-              <w:t> Gói miễn phí sẽ tự động tắt (Pause) nếu sau 7 ngày không có ai truy cập.</w:t>
+              <w:t xml:space="preserve"> Gói miễn </w:t>
+            </w:r>
+            <w:r>
+              <w:rPr>
+                <w:lang w:val="en-US"/>
+              </w:rPr>
+              <w:lastRenderedPageBreak/>
+              <w:t>phí sẽ tự động tắt (Pause) nếu sau 7 ngày không có ai truy cập.</w:t>
             </w:r>
           </w:p>
         </w:tc>
@@ -11827,6 +11726,7 @@
                 <w:bCs/>
                 <w:lang w:val="en-US"/>
               </w:rPr>
+              <w:lastRenderedPageBreak/>
               <w:t>Dung lượng lưu trữ miễn phí</w:t>
             </w:r>
           </w:p>
@@ -12118,14 +12018,7 @@
         <w:rPr>
           <w:lang w:val="en-US"/>
         </w:rPr>
-        <w:t xml:space="preserve">Quyết định lựa chọn: Chọn Microsoft Azure SQL Database để đảm báo tính liên </w:t>
-      </w:r>
-      <w:r>
-        <w:rPr>
-          <w:lang w:val="en-US"/>
-        </w:rPr>
-        <w:lastRenderedPageBreak/>
-        <w:t>thông dữ liệu mượt mà nhất trong hệ sinh thái Microsoft, không phát sinh lỗi kết nối.</w:t>
+        <w:t>Quyết định lựa chọn: Chọn Microsoft Azure SQL Database để đảm báo tính liên thông dữ liệu mượt mà nhất trong hệ sinh thái Microsoft, không phát sinh lỗi kết nối.</w:t>
       </w:r>
     </w:p>
     <w:p>
@@ -12396,7 +12289,16 @@
                 <w:iCs/>
                 <w:lang w:val="en-US"/>
               </w:rPr>
-              <w:t>(Lưu thông tin khách, đơn đặt phòng, hóa đơn)</w:t>
+              <w:t xml:space="preserve">(Lưu </w:t>
+            </w:r>
+            <w:r>
+              <w:rPr>
+                <w:i/>
+                <w:iCs/>
+                <w:lang w:val="en-US"/>
+              </w:rPr>
+              <w:lastRenderedPageBreak/>
+              <w:t>thông tin khách, đơn đặt phòng, hóa đơn)</w:t>
             </w:r>
           </w:p>
         </w:tc>
@@ -12423,6 +12325,7 @@
               <w:rPr>
                 <w:lang w:val="en-US"/>
               </w:rPr>
+              <w:lastRenderedPageBreak/>
               <w:t>Khoảng 7.2 MB / năm </w:t>
             </w:r>
             <w:r>
@@ -12431,7 +12334,16 @@
                 <w:iCs/>
                 <w:lang w:val="en-US"/>
               </w:rPr>
-              <w:t>(7.300 lượt check-in + sổ cái thanh toán)</w:t>
+              <w:t xml:space="preserve">(7.300 lượt </w:t>
+            </w:r>
+            <w:r>
+              <w:rPr>
+                <w:i/>
+                <w:iCs/>
+                <w:lang w:val="en-US"/>
+              </w:rPr>
+              <w:lastRenderedPageBreak/>
+              <w:t>check-in + sổ cái thanh toán)</w:t>
             </w:r>
           </w:p>
         </w:tc>
@@ -12458,6 +12370,7 @@
               <w:rPr>
                 <w:lang w:val="en-US"/>
               </w:rPr>
+              <w:lastRenderedPageBreak/>
               <w:t>32.000 MB (32 GB) </w:t>
             </w:r>
             <w:r>
@@ -12466,7 +12379,16 @@
                 <w:iCs/>
                 <w:lang w:val="en-US"/>
               </w:rPr>
-              <w:t>(Gói miễn phí trọn đời của Azure)</w:t>
+              <w:t xml:space="preserve">(Gói miễn </w:t>
+            </w:r>
+            <w:r>
+              <w:rPr>
+                <w:i/>
+                <w:iCs/>
+                <w:lang w:val="en-US"/>
+              </w:rPr>
+              <w:lastRenderedPageBreak/>
+              <w:t>phí trọn đời của Azure)</w:t>
             </w:r>
           </w:p>
         </w:tc>
@@ -12493,6 +12415,7 @@
               <w:rPr>
                 <w:lang w:val="en-US"/>
               </w:rPr>
+              <w:lastRenderedPageBreak/>
               <w:t>Chỉ dùng 0.02% </w:t>
             </w:r>
             <w:r>
@@ -12501,7 +12424,16 @@
                 <w:iCs/>
                 <w:lang w:val="en-US"/>
               </w:rPr>
-              <w:t>(Dư 99.98%, dùng &gt; 100 năm)</w:t>
+              <w:t xml:space="preserve">(Dư </w:t>
+            </w:r>
+            <w:r>
+              <w:rPr>
+                <w:i/>
+                <w:iCs/>
+                <w:lang w:val="en-US"/>
+              </w:rPr>
+              <w:lastRenderedPageBreak/>
+              <w:t>99.98%, dùng &gt; 100 năm)</w:t>
             </w:r>
           </w:p>
         </w:tc>
@@ -12532,6 +12464,7 @@
                 <w:bCs/>
                 <w:lang w:val="en-US"/>
               </w:rPr>
+              <w:lastRenderedPageBreak/>
               <w:t>Bộ nhớ xử lý (RAM)</w:t>
             </w:r>
             <w:r>
@@ -12839,7 +12772,6 @@
       </w:pPr>
       <w:bookmarkStart w:id="49" w:name="_Toc239934741"/>
       <w:r>
-        <w:lastRenderedPageBreak/>
         <w:t xml:space="preserve">Bảng </w:t>
       </w:r>
       <w:r>
@@ -13110,7 +13042,14 @@
               <w:rPr>
                 <w:lang w:val="en-US"/>
               </w:rPr>
-              <w:t> Phải mở cổng IP máy chủ ra Internet cho Google truy cập, dễ phát sinh lỗi kết nối.</w:t>
+              <w:t xml:space="preserve"> Phải mở cổng IP máy chủ ra Internet cho Google truy cập, dễ phát sinh lỗi kết </w:t>
+            </w:r>
+            <w:r>
+              <w:rPr>
+                <w:lang w:val="en-US"/>
+              </w:rPr>
+              <w:lastRenderedPageBreak/>
+              <w:t>nối.</w:t>
             </w:r>
           </w:p>
         </w:tc>
@@ -13141,6 +13080,7 @@
                 <w:bCs/>
                 <w:lang w:val="en-US"/>
               </w:rPr>
+              <w:lastRenderedPageBreak/>
               <w:t>Tính toán chỉ số chuyên sâu (RevPAR, ADR)</w:t>
             </w:r>
           </w:p>
@@ -14214,6 +14154,232 @@
     </w:lvl>
   </w:abstractNum>
   <w:abstractNum w:abstractNumId="2" w15:restartNumberingAfterBreak="0">
+    <w:nsid w:val="060D602A"/>
+    <w:multiLevelType w:val="multilevel"/>
+    <w:tmpl w:val="DF789E4E"/>
+    <w:lvl w:ilvl="0">
+      <w:start w:val="1"/>
+      <w:numFmt w:val="decimal"/>
+      <w:lvlText w:val="%1."/>
+      <w:lvlJc w:val="left"/>
+      <w:pPr>
+        <w:tabs>
+          <w:tab w:val="num" w:pos="720"/>
+        </w:tabs>
+        <w:ind w:left="720" w:hanging="360"/>
+      </w:pPr>
+    </w:lvl>
+    <w:lvl w:ilvl="1" w:tentative="1">
+      <w:start w:val="1"/>
+      <w:numFmt w:val="decimal"/>
+      <w:lvlText w:val="%2."/>
+      <w:lvlJc w:val="left"/>
+      <w:pPr>
+        <w:tabs>
+          <w:tab w:val="num" w:pos="1440"/>
+        </w:tabs>
+        <w:ind w:left="1440" w:hanging="360"/>
+      </w:pPr>
+    </w:lvl>
+    <w:lvl w:ilvl="2" w:tentative="1">
+      <w:start w:val="1"/>
+      <w:numFmt w:val="decimal"/>
+      <w:lvlText w:val="%3."/>
+      <w:lvlJc w:val="left"/>
+      <w:pPr>
+        <w:tabs>
+          <w:tab w:val="num" w:pos="2160"/>
+        </w:tabs>
+        <w:ind w:left="2160" w:hanging="360"/>
+      </w:pPr>
+    </w:lvl>
+    <w:lvl w:ilvl="3" w:tentative="1">
+      <w:start w:val="1"/>
+      <w:numFmt w:val="decimal"/>
+      <w:lvlText w:val="%4."/>
+      <w:lvlJc w:val="left"/>
+      <w:pPr>
+        <w:tabs>
+          <w:tab w:val="num" w:pos="2880"/>
+        </w:tabs>
+        <w:ind w:left="2880" w:hanging="360"/>
+      </w:pPr>
+    </w:lvl>
+    <w:lvl w:ilvl="4" w:tentative="1">
+      <w:start w:val="1"/>
+      <w:numFmt w:val="decimal"/>
+      <w:lvlText w:val="%5."/>
+      <w:lvlJc w:val="left"/>
+      <w:pPr>
+        <w:tabs>
+          <w:tab w:val="num" w:pos="3600"/>
+        </w:tabs>
+        <w:ind w:left="3600" w:hanging="360"/>
+      </w:pPr>
+    </w:lvl>
+    <w:lvl w:ilvl="5" w:tentative="1">
+      <w:start w:val="1"/>
+      <w:numFmt w:val="decimal"/>
+      <w:lvlText w:val="%6."/>
+      <w:lvlJc w:val="left"/>
+      <w:pPr>
+        <w:tabs>
+          <w:tab w:val="num" w:pos="4320"/>
+        </w:tabs>
+        <w:ind w:left="4320" w:hanging="360"/>
+      </w:pPr>
+    </w:lvl>
+    <w:lvl w:ilvl="6" w:tentative="1">
+      <w:start w:val="1"/>
+      <w:numFmt w:val="decimal"/>
+      <w:lvlText w:val="%7."/>
+      <w:lvlJc w:val="left"/>
+      <w:pPr>
+        <w:tabs>
+          <w:tab w:val="num" w:pos="5040"/>
+        </w:tabs>
+        <w:ind w:left="5040" w:hanging="360"/>
+      </w:pPr>
+    </w:lvl>
+    <w:lvl w:ilvl="7" w:tentative="1">
+      <w:start w:val="1"/>
+      <w:numFmt w:val="decimal"/>
+      <w:lvlText w:val="%8."/>
+      <w:lvlJc w:val="left"/>
+      <w:pPr>
+        <w:tabs>
+          <w:tab w:val="num" w:pos="5760"/>
+        </w:tabs>
+        <w:ind w:left="5760" w:hanging="360"/>
+      </w:pPr>
+    </w:lvl>
+    <w:lvl w:ilvl="8" w:tentative="1">
+      <w:start w:val="1"/>
+      <w:numFmt w:val="decimal"/>
+      <w:lvlText w:val="%9."/>
+      <w:lvlJc w:val="left"/>
+      <w:pPr>
+        <w:tabs>
+          <w:tab w:val="num" w:pos="6480"/>
+        </w:tabs>
+        <w:ind w:left="6480" w:hanging="360"/>
+      </w:pPr>
+    </w:lvl>
+  </w:abstractNum>
+  <w:abstractNum w:abstractNumId="3" w15:restartNumberingAfterBreak="0">
+    <w:nsid w:val="109D783A"/>
+    <w:multiLevelType w:val="hybridMultilevel"/>
+    <w:tmpl w:val="28DE3680"/>
+    <w:lvl w:ilvl="0" w:tplc="04090001">
+      <w:start w:val="1"/>
+      <w:numFmt w:val="bullet"/>
+      <w:lvlText w:val=""/>
+      <w:lvlJc w:val="left"/>
+      <w:pPr>
+        <w:ind w:left="360" w:hanging="360"/>
+      </w:pPr>
+      <w:rPr>
+        <w:rFonts w:ascii="Symbol" w:hAnsi="Symbol" w:hint="default"/>
+      </w:rPr>
+    </w:lvl>
+    <w:lvl w:ilvl="1" w:tplc="04090003" w:tentative="1">
+      <w:start w:val="1"/>
+      <w:numFmt w:val="bullet"/>
+      <w:lvlText w:val="o"/>
+      <w:lvlJc w:val="left"/>
+      <w:pPr>
+        <w:ind w:left="1080" w:hanging="360"/>
+      </w:pPr>
+      <w:rPr>
+        <w:rFonts w:ascii="Courier New" w:hAnsi="Courier New" w:cs="Courier New" w:hint="default"/>
+      </w:rPr>
+    </w:lvl>
+    <w:lvl w:ilvl="2" w:tplc="04090005" w:tentative="1">
+      <w:start w:val="1"/>
+      <w:numFmt w:val="bullet"/>
+      <w:lvlText w:val=""/>
+      <w:lvlJc w:val="left"/>
+      <w:pPr>
+        <w:ind w:left="1800" w:hanging="360"/>
+      </w:pPr>
+      <w:rPr>
+        <w:rFonts w:ascii="Wingdings" w:hAnsi="Wingdings" w:hint="default"/>
+      </w:rPr>
+    </w:lvl>
+    <w:lvl w:ilvl="3" w:tplc="04090001" w:tentative="1">
+      <w:start w:val="1"/>
+      <w:numFmt w:val="bullet"/>
+      <w:lvlText w:val=""/>
+      <w:lvlJc w:val="left"/>
+      <w:pPr>
+        <w:ind w:left="2520" w:hanging="360"/>
+      </w:pPr>
+      <w:rPr>
+        <w:rFonts w:ascii="Symbol" w:hAnsi="Symbol" w:hint="default"/>
+      </w:rPr>
+    </w:lvl>
+    <w:lvl w:ilvl="4" w:tplc="04090003" w:tentative="1">
+      <w:start w:val="1"/>
+      <w:numFmt w:val="bullet"/>
+      <w:lvlText w:val="o"/>
+      <w:lvlJc w:val="left"/>
+      <w:pPr>
+        <w:ind w:left="3240" w:hanging="360"/>
+      </w:pPr>
+      <w:rPr>
+        <w:rFonts w:ascii="Courier New" w:hAnsi="Courier New" w:cs="Courier New" w:hint="default"/>
+      </w:rPr>
+    </w:lvl>
+    <w:lvl w:ilvl="5" w:tplc="04090005" w:tentative="1">
+      <w:start w:val="1"/>
+      <w:numFmt w:val="bullet"/>
+      <w:lvlText w:val=""/>
+      <w:lvlJc w:val="left"/>
+      <w:pPr>
+        <w:ind w:left="3960" w:hanging="360"/>
+      </w:pPr>
+      <w:rPr>
+        <w:rFonts w:ascii="Wingdings" w:hAnsi="Wingdings" w:hint="default"/>
+      </w:rPr>
+    </w:lvl>
+    <w:lvl w:ilvl="6" w:tplc="04090001" w:tentative="1">
+      <w:start w:val="1"/>
+      <w:numFmt w:val="bullet"/>
+      <w:lvlText w:val=""/>
+      <w:lvlJc w:val="left"/>
+      <w:pPr>
+        <w:ind w:left="4680" w:hanging="360"/>
+      </w:pPr>
+      <w:rPr>
+        <w:rFonts w:ascii="Symbol" w:hAnsi="Symbol" w:hint="default"/>
+      </w:rPr>
+    </w:lvl>
+    <w:lvl w:ilvl="7" w:tplc="04090003" w:tentative="1">
+      <w:start w:val="1"/>
+      <w:numFmt w:val="bullet"/>
+      <w:lvlText w:val="o"/>
+      <w:lvlJc w:val="left"/>
+      <w:pPr>
+        <w:ind w:left="5400" w:hanging="360"/>
+      </w:pPr>
+      <w:rPr>
+        <w:rFonts w:ascii="Courier New" w:hAnsi="Courier New" w:cs="Courier New" w:hint="default"/>
+      </w:rPr>
+    </w:lvl>
+    <w:lvl w:ilvl="8" w:tplc="04090005" w:tentative="1">
+      <w:start w:val="1"/>
+      <w:numFmt w:val="bullet"/>
+      <w:lvlText w:val=""/>
+      <w:lvlJc w:val="left"/>
+      <w:pPr>
+        <w:ind w:left="6120" w:hanging="360"/>
+      </w:pPr>
+      <w:rPr>
+        <w:rFonts w:ascii="Wingdings" w:hAnsi="Wingdings" w:hint="default"/>
+      </w:rPr>
+    </w:lvl>
+  </w:abstractNum>
+  <w:abstractNum w:abstractNumId="4" w15:restartNumberingAfterBreak="0">
     <w:nsid w:val="231B78DB"/>
     <w:multiLevelType w:val="hybridMultilevel"/>
     <w:tmpl w:val="818C7B74"/>
@@ -14326,7 +14492,7 @@
       </w:rPr>
     </w:lvl>
   </w:abstractNum>
-  <w:abstractNum w:abstractNumId="3" w15:restartNumberingAfterBreak="0">
+  <w:abstractNum w:abstractNumId="5" w15:restartNumberingAfterBreak="0">
     <w:nsid w:val="23B17E1A"/>
     <w:multiLevelType w:val="hybridMultilevel"/>
     <w:tmpl w:val="E73C83B4"/>
@@ -14439,7 +14605,7 @@
       </w:rPr>
     </w:lvl>
   </w:abstractNum>
-  <w:abstractNum w:abstractNumId="4" w15:restartNumberingAfterBreak="0">
+  <w:abstractNum w:abstractNumId="6" w15:restartNumberingAfterBreak="0">
     <w:nsid w:val="246B5188"/>
     <w:multiLevelType w:val="hybridMultilevel"/>
     <w:tmpl w:val="A4584B8A"/>
@@ -14552,7 +14718,7 @@
       </w:rPr>
     </w:lvl>
   </w:abstractNum>
-  <w:abstractNum w:abstractNumId="5" w15:restartNumberingAfterBreak="0">
+  <w:abstractNum w:abstractNumId="7" w15:restartNumberingAfterBreak="0">
     <w:nsid w:val="24917E52"/>
     <w:multiLevelType w:val="multilevel"/>
     <w:tmpl w:val="EA929AE0"/>
@@ -14701,7 +14867,7 @@
       </w:rPr>
     </w:lvl>
   </w:abstractNum>
-  <w:abstractNum w:abstractNumId="6" w15:restartNumberingAfterBreak="0">
+  <w:abstractNum w:abstractNumId="8" w15:restartNumberingAfterBreak="0">
     <w:nsid w:val="24F92117"/>
     <w:multiLevelType w:val="hybridMultilevel"/>
     <w:tmpl w:val="A4D62932"/>
@@ -14814,7 +14980,7 @@
       </w:rPr>
     </w:lvl>
   </w:abstractNum>
-  <w:abstractNum w:abstractNumId="7" w15:restartNumberingAfterBreak="0">
+  <w:abstractNum w:abstractNumId="9" w15:restartNumberingAfterBreak="0">
     <w:nsid w:val="27C56119"/>
     <w:multiLevelType w:val="multilevel"/>
     <w:tmpl w:val="A02055C2"/>
@@ -14959,7 +15125,7 @@
       </w:rPr>
     </w:lvl>
   </w:abstractNum>
-  <w:abstractNum w:abstractNumId="8" w15:restartNumberingAfterBreak="0">
+  <w:abstractNum w:abstractNumId="10" w15:restartNumberingAfterBreak="0">
     <w:nsid w:val="2D5C5E34"/>
     <w:multiLevelType w:val="hybridMultilevel"/>
     <w:tmpl w:val="8F1CC3EA"/>
@@ -15048,7 +15214,7 @@
       </w:pPr>
     </w:lvl>
   </w:abstractNum>
-  <w:abstractNum w:abstractNumId="9" w15:restartNumberingAfterBreak="0">
+  <w:abstractNum w:abstractNumId="11" w15:restartNumberingAfterBreak="0">
     <w:nsid w:val="31C464E1"/>
     <w:multiLevelType w:val="hybridMultilevel"/>
     <w:tmpl w:val="8EE435D8"/>
@@ -15161,7 +15327,7 @@
       </w:rPr>
     </w:lvl>
   </w:abstractNum>
-  <w:abstractNum w:abstractNumId="10" w15:restartNumberingAfterBreak="0">
+  <w:abstractNum w:abstractNumId="12" w15:restartNumberingAfterBreak="0">
     <w:nsid w:val="3636004B"/>
     <w:multiLevelType w:val="multilevel"/>
     <w:tmpl w:val="B57CEF54"/>
@@ -15306,7 +15472,7 @@
       </w:rPr>
     </w:lvl>
   </w:abstractNum>
-  <w:abstractNum w:abstractNumId="11" w15:restartNumberingAfterBreak="0">
+  <w:abstractNum w:abstractNumId="13" w15:restartNumberingAfterBreak="0">
     <w:nsid w:val="3C350581"/>
     <w:multiLevelType w:val="multilevel"/>
     <w:tmpl w:val="C456B6D0"/>
@@ -15451,7 +15617,7 @@
       </w:rPr>
     </w:lvl>
   </w:abstractNum>
-  <w:abstractNum w:abstractNumId="12" w15:restartNumberingAfterBreak="0">
+  <w:abstractNum w:abstractNumId="14" w15:restartNumberingAfterBreak="0">
     <w:nsid w:val="3E563828"/>
     <w:multiLevelType w:val="multilevel"/>
     <w:tmpl w:val="49164C8A"/>
@@ -15596,7 +15762,7 @@
       </w:rPr>
     </w:lvl>
   </w:abstractNum>
-  <w:abstractNum w:abstractNumId="13" w15:restartNumberingAfterBreak="0">
+  <w:abstractNum w:abstractNumId="15" w15:restartNumberingAfterBreak="0">
     <w:nsid w:val="4F9135AB"/>
     <w:multiLevelType w:val="multilevel"/>
     <w:tmpl w:val="2E803308"/>
@@ -15745,7 +15911,7 @@
       </w:rPr>
     </w:lvl>
   </w:abstractNum>
-  <w:abstractNum w:abstractNumId="14" w15:restartNumberingAfterBreak="0">
+  <w:abstractNum w:abstractNumId="16" w15:restartNumberingAfterBreak="0">
     <w:nsid w:val="506907CE"/>
     <w:multiLevelType w:val="multilevel"/>
     <w:tmpl w:val="5A4C8A6C"/>
@@ -15890,7 +16056,7 @@
       </w:rPr>
     </w:lvl>
   </w:abstractNum>
-  <w:abstractNum w:abstractNumId="15" w15:restartNumberingAfterBreak="0">
+  <w:abstractNum w:abstractNumId="17" w15:restartNumberingAfterBreak="0">
     <w:nsid w:val="58F453E0"/>
     <w:multiLevelType w:val="multilevel"/>
     <w:tmpl w:val="109C6D06"/>
@@ -16039,7 +16205,7 @@
       </w:rPr>
     </w:lvl>
   </w:abstractNum>
-  <w:abstractNum w:abstractNumId="16" w15:restartNumberingAfterBreak="0">
+  <w:abstractNum w:abstractNumId="18" w15:restartNumberingAfterBreak="0">
     <w:nsid w:val="597E793E"/>
     <w:multiLevelType w:val="multilevel"/>
     <w:tmpl w:val="10DABD46"/>
@@ -16152,7 +16318,7 @@
       </w:pPr>
     </w:lvl>
   </w:abstractNum>
-  <w:abstractNum w:abstractNumId="17" w15:restartNumberingAfterBreak="0">
+  <w:abstractNum w:abstractNumId="19" w15:restartNumberingAfterBreak="0">
     <w:nsid w:val="5A541832"/>
     <w:multiLevelType w:val="multilevel"/>
     <w:tmpl w:val="891A1E64"/>
@@ -16250,7 +16416,7 @@
       </w:pPr>
     </w:lvl>
   </w:abstractNum>
-  <w:abstractNum w:abstractNumId="18" w15:restartNumberingAfterBreak="0">
+  <w:abstractNum w:abstractNumId="20" w15:restartNumberingAfterBreak="0">
     <w:nsid w:val="63DC3A27"/>
     <w:multiLevelType w:val="multilevel"/>
     <w:tmpl w:val="48D0EC1E"/>
@@ -16395,7 +16561,120 @@
       </w:rPr>
     </w:lvl>
   </w:abstractNum>
-  <w:abstractNum w:abstractNumId="19" w15:restartNumberingAfterBreak="0">
+  <w:abstractNum w:abstractNumId="21" w15:restartNumberingAfterBreak="0">
+    <w:nsid w:val="665C1CDD"/>
+    <w:multiLevelType w:val="multilevel"/>
+    <w:tmpl w:val="055E206A"/>
+    <w:lvl w:ilvl="0">
+      <w:start w:val="1"/>
+      <w:numFmt w:val="decimal"/>
+      <w:lvlText w:val="%1."/>
+      <w:lvlJc w:val="left"/>
+      <w:pPr>
+        <w:tabs>
+          <w:tab w:val="num" w:pos="720"/>
+        </w:tabs>
+        <w:ind w:left="720" w:hanging="360"/>
+      </w:pPr>
+    </w:lvl>
+    <w:lvl w:ilvl="1" w:tentative="1">
+      <w:start w:val="1"/>
+      <w:numFmt w:val="decimal"/>
+      <w:lvlText w:val="%2."/>
+      <w:lvlJc w:val="left"/>
+      <w:pPr>
+        <w:tabs>
+          <w:tab w:val="num" w:pos="1440"/>
+        </w:tabs>
+        <w:ind w:left="1440" w:hanging="360"/>
+      </w:pPr>
+    </w:lvl>
+    <w:lvl w:ilvl="2" w:tentative="1">
+      <w:start w:val="1"/>
+      <w:numFmt w:val="decimal"/>
+      <w:lvlText w:val="%3."/>
+      <w:lvlJc w:val="left"/>
+      <w:pPr>
+        <w:tabs>
+          <w:tab w:val="num" w:pos="2160"/>
+        </w:tabs>
+        <w:ind w:left="2160" w:hanging="360"/>
+      </w:pPr>
+    </w:lvl>
+    <w:lvl w:ilvl="3" w:tentative="1">
+      <w:start w:val="1"/>
+      <w:numFmt w:val="decimal"/>
+      <w:lvlText w:val="%4."/>
+      <w:lvlJc w:val="left"/>
+      <w:pPr>
+        <w:tabs>
+          <w:tab w:val="num" w:pos="2880"/>
+        </w:tabs>
+        <w:ind w:left="2880" w:hanging="360"/>
+      </w:pPr>
+    </w:lvl>
+    <w:lvl w:ilvl="4" w:tentative="1">
+      <w:start w:val="1"/>
+      <w:numFmt w:val="decimal"/>
+      <w:lvlText w:val="%5."/>
+      <w:lvlJc w:val="left"/>
+      <w:pPr>
+        <w:tabs>
+          <w:tab w:val="num" w:pos="3600"/>
+        </w:tabs>
+        <w:ind w:left="3600" w:hanging="360"/>
+      </w:pPr>
+    </w:lvl>
+    <w:lvl w:ilvl="5" w:tentative="1">
+      <w:start w:val="1"/>
+      <w:numFmt w:val="decimal"/>
+      <w:lvlText w:val="%6."/>
+      <w:lvlJc w:val="left"/>
+      <w:pPr>
+        <w:tabs>
+          <w:tab w:val="num" w:pos="4320"/>
+        </w:tabs>
+        <w:ind w:left="4320" w:hanging="360"/>
+      </w:pPr>
+    </w:lvl>
+    <w:lvl w:ilvl="6" w:tentative="1">
+      <w:start w:val="1"/>
+      <w:numFmt w:val="decimal"/>
+      <w:lvlText w:val="%7."/>
+      <w:lvlJc w:val="left"/>
+      <w:pPr>
+        <w:tabs>
+          <w:tab w:val="num" w:pos="5040"/>
+        </w:tabs>
+        <w:ind w:left="5040" w:hanging="360"/>
+      </w:pPr>
+    </w:lvl>
+    <w:lvl w:ilvl="7" w:tentative="1">
+      <w:start w:val="1"/>
+      <w:numFmt w:val="decimal"/>
+      <w:lvlText w:val="%8."/>
+      <w:lvlJc w:val="left"/>
+      <w:pPr>
+        <w:tabs>
+          <w:tab w:val="num" w:pos="5760"/>
+        </w:tabs>
+        <w:ind w:left="5760" w:hanging="360"/>
+      </w:pPr>
+    </w:lvl>
+    <w:lvl w:ilvl="8" w:tentative="1">
+      <w:start w:val="1"/>
+      <w:numFmt w:val="decimal"/>
+      <w:lvlText w:val="%9."/>
+      <w:lvlJc w:val="left"/>
+      <w:pPr>
+        <w:tabs>
+          <w:tab w:val="num" w:pos="6480"/>
+        </w:tabs>
+        <w:ind w:left="6480" w:hanging="360"/>
+      </w:pPr>
+    </w:lvl>
+  </w:abstractNum>
+  <w:abstractNum w:abstractNumId="22" w15:restartNumberingAfterBreak="0">
     <w:nsid w:val="6B962E1F"/>
     <w:multiLevelType w:val="hybridMultilevel"/>
     <w:tmpl w:val="3634BE9E"/>
@@ -16508,7 +16787,7 @@
       </w:rPr>
     </w:lvl>
   </w:abstractNum>
-  <w:abstractNum w:abstractNumId="20" w15:restartNumberingAfterBreak="0">
+  <w:abstractNum w:abstractNumId="23" w15:restartNumberingAfterBreak="0">
     <w:nsid w:val="6BDF13AB"/>
     <w:multiLevelType w:val="multilevel"/>
     <w:tmpl w:val="5FD28938"/>
@@ -16653,7 +16932,7 @@
       </w:rPr>
     </w:lvl>
   </w:abstractNum>
-  <w:abstractNum w:abstractNumId="21" w15:restartNumberingAfterBreak="0">
+  <w:abstractNum w:abstractNumId="24" w15:restartNumberingAfterBreak="0">
     <w:nsid w:val="6DE40236"/>
     <w:multiLevelType w:val="hybridMultilevel"/>
     <w:tmpl w:val="35101F9C"/>
@@ -16742,7 +17021,7 @@
       </w:pPr>
     </w:lvl>
   </w:abstractNum>
-  <w:abstractNum w:abstractNumId="22" w15:restartNumberingAfterBreak="0">
+  <w:abstractNum w:abstractNumId="25" w15:restartNumberingAfterBreak="0">
     <w:nsid w:val="6FF85F8E"/>
     <w:multiLevelType w:val="multilevel"/>
     <w:tmpl w:val="1D6E8576"/>
@@ -16891,7 +17170,7 @@
       </w:rPr>
     </w:lvl>
   </w:abstractNum>
-  <w:abstractNum w:abstractNumId="23" w15:restartNumberingAfterBreak="0">
+  <w:abstractNum w:abstractNumId="26" w15:restartNumberingAfterBreak="0">
     <w:nsid w:val="74AE143B"/>
     <w:multiLevelType w:val="multilevel"/>
     <w:tmpl w:val="AADAF89C"/>
@@ -17040,7 +17319,120 @@
       </w:rPr>
     </w:lvl>
   </w:abstractNum>
-  <w:abstractNum w:abstractNumId="24" w15:restartNumberingAfterBreak="0">
+  <w:abstractNum w:abstractNumId="27" w15:restartNumberingAfterBreak="0">
+    <w:nsid w:val="7B845C5F"/>
+    <w:multiLevelType w:val="multilevel"/>
+    <w:tmpl w:val="009840F8"/>
+    <w:lvl w:ilvl="0">
+      <w:start w:val="1"/>
+      <w:numFmt w:val="decimal"/>
+      <w:lvlText w:val="%1."/>
+      <w:lvlJc w:val="left"/>
+      <w:pPr>
+        <w:tabs>
+          <w:tab w:val="num" w:pos="720"/>
+        </w:tabs>
+        <w:ind w:left="720" w:hanging="360"/>
+      </w:pPr>
+    </w:lvl>
+    <w:lvl w:ilvl="1" w:tentative="1">
+      <w:start w:val="1"/>
+      <w:numFmt w:val="decimal"/>
+      <w:lvlText w:val="%2."/>
+      <w:lvlJc w:val="left"/>
+      <w:pPr>
+        <w:tabs>
+          <w:tab w:val="num" w:pos="1440"/>
+        </w:tabs>
+        <w:ind w:left="1440" w:hanging="360"/>
+      </w:pPr>
+    </w:lvl>
+    <w:lvl w:ilvl="2" w:tentative="1">
+      <w:start w:val="1"/>
+      <w:numFmt w:val="decimal"/>
+      <w:lvlText w:val="%3."/>
+      <w:lvlJc w:val="left"/>
+      <w:pPr>
+        <w:tabs>
+          <w:tab w:val="num" w:pos="2160"/>
+        </w:tabs>
+        <w:ind w:left="2160" w:hanging="360"/>
+      </w:pPr>
+    </w:lvl>
+    <w:lvl w:ilvl="3" w:tentative="1">
+      <w:start w:val="1"/>
+      <w:numFmt w:val="decimal"/>
+      <w:lvlText w:val="%4."/>
+      <w:lvlJc w:val="left"/>
+      <w:pPr>
+        <w:tabs>
+          <w:tab w:val="num" w:pos="2880"/>
+        </w:tabs>
+        <w:ind w:left="2880" w:hanging="360"/>
+      </w:pPr>
+    </w:lvl>
+    <w:lvl w:ilvl="4" w:tentative="1">
+      <w:start w:val="1"/>
+      <w:numFmt w:val="decimal"/>
+      <w:lvlText w:val="%5."/>
+      <w:lvlJc w:val="left"/>
+      <w:pPr>
+        <w:tabs>
+          <w:tab w:val="num" w:pos="3600"/>
+        </w:tabs>
+        <w:ind w:left="3600" w:hanging="360"/>
+      </w:pPr>
+    </w:lvl>
+    <w:lvl w:ilvl="5" w:tentative="1">
+      <w:start w:val="1"/>
+      <w:numFmt w:val="decimal"/>
+      <w:lvlText w:val="%6."/>
+      <w:lvlJc w:val="left"/>
+      <w:pPr>
+        <w:tabs>
+          <w:tab w:val="num" w:pos="4320"/>
+        </w:tabs>
+        <w:ind w:left="4320" w:hanging="360"/>
+      </w:pPr>
+    </w:lvl>
+    <w:lvl w:ilvl="6" w:tentative="1">
+      <w:start w:val="1"/>
+      <w:numFmt w:val="decimal"/>
+      <w:lvlText w:val="%7."/>
+      <w:lvlJc w:val="left"/>
+      <w:pPr>
+        <w:tabs>
+          <w:tab w:val="num" w:pos="5040"/>
+        </w:tabs>
+        <w:ind w:left="5040" w:hanging="360"/>
+      </w:pPr>
+    </w:lvl>
+    <w:lvl w:ilvl="7" w:tentative="1">
+      <w:start w:val="1"/>
+      <w:numFmt w:val="decimal"/>
+      <w:lvlText w:val="%8."/>
+      <w:lvlJc w:val="left"/>
+      <w:pPr>
+        <w:tabs>
+          <w:tab w:val="num" w:pos="5760"/>
+        </w:tabs>
+        <w:ind w:left="5760" w:hanging="360"/>
+      </w:pPr>
+    </w:lvl>
+    <w:lvl w:ilvl="8" w:tentative="1">
+      <w:start w:val="1"/>
+      <w:numFmt w:val="decimal"/>
+      <w:lvlText w:val="%9."/>
+      <w:lvlJc w:val="left"/>
+      <w:pPr>
+        <w:tabs>
+          <w:tab w:val="num" w:pos="6480"/>
+        </w:tabs>
+        <w:ind w:left="6480" w:hanging="360"/>
+      </w:pPr>
+    </w:lvl>
+  </w:abstractNum>
+  <w:abstractNum w:abstractNumId="28" w15:restartNumberingAfterBreak="0">
     <w:nsid w:val="7C4F3E65"/>
     <w:multiLevelType w:val="hybridMultilevel"/>
     <w:tmpl w:val="CB761DC0"/>
@@ -17154,22 +17546,22 @@
     </w:lvl>
   </w:abstractNum>
   <w:num w:numId="1" w16cid:durableId="1138301041">
-    <w:abstractNumId w:val="17"/>
+    <w:abstractNumId w:val="19"/>
   </w:num>
   <w:num w:numId="2" w16cid:durableId="525102607">
     <w:abstractNumId w:val="1"/>
   </w:num>
   <w:num w:numId="3" w16cid:durableId="2084595190">
-    <w:abstractNumId w:val="10"/>
+    <w:abstractNumId w:val="12"/>
   </w:num>
   <w:num w:numId="4" w16cid:durableId="1322923780">
-    <w:abstractNumId w:val="20"/>
+    <w:abstractNumId w:val="23"/>
   </w:num>
   <w:num w:numId="5" w16cid:durableId="1854955174">
-    <w:abstractNumId w:val="14"/>
+    <w:abstractNumId w:val="16"/>
   </w:num>
   <w:num w:numId="6" w16cid:durableId="1838419465">
-    <w:abstractNumId w:val="14"/>
+    <w:abstractNumId w:val="16"/>
     <w:lvlOverride w:ilvl="1">
       <w:lvl w:ilvl="1">
         <w:numFmt w:val="bullet"/>
@@ -17189,10 +17581,10 @@
     </w:lvlOverride>
   </w:num>
   <w:num w:numId="7" w16cid:durableId="1854145092">
-    <w:abstractNumId w:val="11"/>
+    <w:abstractNumId w:val="13"/>
   </w:num>
   <w:num w:numId="8" w16cid:durableId="835730678">
-    <w:abstractNumId w:val="11"/>
+    <w:abstractNumId w:val="13"/>
     <w:lvlOverride w:ilvl="1">
       <w:lvl w:ilvl="1">
         <w:numFmt w:val="bullet"/>
@@ -17212,10 +17604,10 @@
     </w:lvlOverride>
   </w:num>
   <w:num w:numId="9" w16cid:durableId="1705010785">
-    <w:abstractNumId w:val="18"/>
+    <w:abstractNumId w:val="20"/>
   </w:num>
   <w:num w:numId="10" w16cid:durableId="1993484100">
-    <w:abstractNumId w:val="18"/>
+    <w:abstractNumId w:val="20"/>
     <w:lvlOverride w:ilvl="1">
       <w:lvl w:ilvl="1">
         <w:numFmt w:val="bullet"/>
@@ -17235,13 +17627,13 @@
     </w:lvlOverride>
   </w:num>
   <w:num w:numId="11" w16cid:durableId="1375421535">
-    <w:abstractNumId w:val="12"/>
+    <w:abstractNumId w:val="14"/>
   </w:num>
   <w:num w:numId="12" w16cid:durableId="854998846">
-    <w:abstractNumId w:val="7"/>
+    <w:abstractNumId w:val="9"/>
   </w:num>
   <w:num w:numId="13" w16cid:durableId="1100292208">
-    <w:abstractNumId w:val="7"/>
+    <w:abstractNumId w:val="9"/>
     <w:lvlOverride w:ilvl="1">
       <w:lvl w:ilvl="1">
         <w:numFmt w:val="bullet"/>
@@ -17261,52 +17653,64 @@
     </w:lvlOverride>
   </w:num>
   <w:num w:numId="14" w16cid:durableId="1651790638">
-    <w:abstractNumId w:val="16"/>
+    <w:abstractNumId w:val="18"/>
   </w:num>
   <w:num w:numId="15" w16cid:durableId="590818714">
-    <w:abstractNumId w:val="21"/>
+    <w:abstractNumId w:val="24"/>
   </w:num>
   <w:num w:numId="16" w16cid:durableId="1772698652">
-    <w:abstractNumId w:val="9"/>
+    <w:abstractNumId w:val="11"/>
   </w:num>
   <w:num w:numId="17" w16cid:durableId="2010253993">
-    <w:abstractNumId w:val="2"/>
+    <w:abstractNumId w:val="4"/>
   </w:num>
   <w:num w:numId="18" w16cid:durableId="559052020">
-    <w:abstractNumId w:val="24"/>
+    <w:abstractNumId w:val="28"/>
   </w:num>
   <w:num w:numId="19" w16cid:durableId="184906971">
-    <w:abstractNumId w:val="8"/>
+    <w:abstractNumId w:val="10"/>
   </w:num>
   <w:num w:numId="20" w16cid:durableId="1645692371">
     <w:abstractNumId w:val="0"/>
   </w:num>
   <w:num w:numId="21" w16cid:durableId="1335916241">
+    <w:abstractNumId w:val="25"/>
+  </w:num>
+  <w:num w:numId="22" w16cid:durableId="1990859723">
+    <w:abstractNumId w:val="7"/>
+  </w:num>
+  <w:num w:numId="23" w16cid:durableId="208954796">
+    <w:abstractNumId w:val="17"/>
+  </w:num>
+  <w:num w:numId="24" w16cid:durableId="16737471">
+    <w:abstractNumId w:val="26"/>
+  </w:num>
+  <w:num w:numId="25" w16cid:durableId="244729046">
+    <w:abstractNumId w:val="15"/>
+  </w:num>
+  <w:num w:numId="26" w16cid:durableId="1175261422">
+    <w:abstractNumId w:val="5"/>
+  </w:num>
+  <w:num w:numId="27" w16cid:durableId="260723989">
+    <w:abstractNumId w:val="6"/>
+  </w:num>
+  <w:num w:numId="28" w16cid:durableId="1982080808">
     <w:abstractNumId w:val="22"/>
   </w:num>
-  <w:num w:numId="22" w16cid:durableId="1990859723">
-    <w:abstractNumId w:val="5"/>
+  <w:num w:numId="29" w16cid:durableId="435177208">
+    <w:abstractNumId w:val="8"/>
   </w:num>
-  <w:num w:numId="23" w16cid:durableId="208954796">
-    <w:abstractNumId w:val="15"/>
+  <w:num w:numId="30" w16cid:durableId="1079910025">
+    <w:abstractNumId w:val="2"/>
   </w:num>
-  <w:num w:numId="24" w16cid:durableId="16737471">
-    <w:abstractNumId w:val="23"/>
+  <w:num w:numId="31" w16cid:durableId="53553635">
+    <w:abstractNumId w:val="21"/>
   </w:num>
-  <w:num w:numId="25" w16cid:durableId="244729046">
-    <w:abstractNumId w:val="13"/>
+  <w:num w:numId="32" w16cid:durableId="1547063426">
+    <w:abstractNumId w:val="27"/>
   </w:num>
-  <w:num w:numId="26" w16cid:durableId="1175261422">
+  <w:num w:numId="33" w16cid:durableId="1790934748">
     <w:abstractNumId w:val="3"/>
-  </w:num>
-  <w:num w:numId="27" w16cid:durableId="260723989">
-    <w:abstractNumId w:val="4"/>
-  </w:num>
-  <w:num w:numId="28" w16cid:durableId="1982080808">
-    <w:abstractNumId w:val="19"/>
-  </w:num>
-  <w:num w:numId="29" w16cid:durableId="435177208">
-    <w:abstractNumId w:val="6"/>
   </w:num>
   <w:numIdMacAtCleanup w:val="13"/>
 </w:numbering>
@@ -18791,6 +19195,23 @@
 </file>
 
 <file path=customXml/item2.xml><?xml version="1.0" encoding="utf-8"?>
+<p:properties xmlns:p="http://schemas.microsoft.com/office/2006/metadata/properties" xmlns:xsi="http://www.w3.org/2001/XMLSchema-instance" xmlns:pc="http://schemas.microsoft.com/office/infopath/2007/PartnerControls">
+  <documentManagement>
+    <_activity xmlns="877bdf97-3d41-40e9-8c5f-d7d9b3bdd278" xsi:nil="true"/>
+  </documentManagement>
+</p:properties>
+</file>
+
+<file path=customXml/item3.xml><?xml version="1.0" encoding="utf-8"?>
+<?mso-contentType ?>
+<FormTemplates xmlns="http://schemas.microsoft.com/sharepoint/v3/contenttype/forms">
+  <Display>DocumentLibraryForm</Display>
+  <Edit>DocumentLibraryForm</Edit>
+  <New>DocumentLibraryForm</New>
+</FormTemplates>
+</file>
+
+<file path=customXml/item4.xml><?xml version="1.0" encoding="utf-8"?>
 <ct:contentTypeSchema xmlns:ct="http://schemas.microsoft.com/office/2006/metadata/contentType" xmlns:ma="http://schemas.microsoft.com/office/2006/metadata/properties/metaAttributes" ct:_="" ma:_="" ma:contentTypeName="Document" ma:contentTypeID="0x010100BCB3C5442D2DA949825C55DE61B37A90" ma:contentTypeVersion="10" ma:contentTypeDescription="Create a new document." ma:contentTypeScope="" ma:versionID="47ced5c2a0c8b8c9903cbc32be688757">
   <xsd:schema xmlns:xsd="http://www.w3.org/2001/XMLSchema" xmlns:xs="http://www.w3.org/2001/XMLSchema" xmlns:p="http://schemas.microsoft.com/office/2006/metadata/properties" xmlns:ns3="877bdf97-3d41-40e9-8c5f-d7d9b3bdd278" targetNamespace="http://schemas.microsoft.com/office/2006/metadata/properties" ma:root="true" ma:fieldsID="c888cd089f346434d7375c951b2e0d29" ns3:_="">
     <xsd:import namespace="877bdf97-3d41-40e9-8c5f-d7d9b3bdd278"/>
@@ -18970,23 +19391,6 @@
 </ct:contentTypeSchema>
 </file>
 
-<file path=customXml/item3.xml><?xml version="1.0" encoding="utf-8"?>
-<?mso-contentType ?>
-<FormTemplates xmlns="http://schemas.microsoft.com/sharepoint/v3/contenttype/forms">
-  <Display>DocumentLibraryForm</Display>
-  <Edit>DocumentLibraryForm</Edit>
-  <New>DocumentLibraryForm</New>
-</FormTemplates>
-</file>
-
-<file path=customXml/item4.xml><?xml version="1.0" encoding="utf-8"?>
-<p:properties xmlns:p="http://schemas.microsoft.com/office/2006/metadata/properties" xmlns:xsi="http://www.w3.org/2001/XMLSchema-instance" xmlns:pc="http://schemas.microsoft.com/office/infopath/2007/PartnerControls">
-  <documentManagement>
-    <_activity xmlns="877bdf97-3d41-40e9-8c5f-d7d9b3bdd278" xsi:nil="true"/>
-  </documentManagement>
-</p:properties>
-</file>
-
 <file path=customXml/itemProps1.xml><?xml version="1.0" encoding="utf-8"?>
 <ds:datastoreItem xmlns:ds="http://schemas.openxmlformats.org/officeDocument/2006/customXml" ds:itemID="{06514009-E878-7249-AEB4-E21DD04B0895}">
   <ds:schemaRefs>
@@ -18996,6 +19400,24 @@
 </file>
 
 <file path=customXml/itemProps2.xml><?xml version="1.0" encoding="utf-8"?>
+<ds:datastoreItem xmlns:ds="http://schemas.openxmlformats.org/officeDocument/2006/customXml" ds:itemID="{E8C558B8-7F08-4E37-A8FA-E88348FD1BA6}">
+  <ds:schemaRefs>
+    <ds:schemaRef ds:uri="http://schemas.microsoft.com/office/2006/metadata/properties"/>
+    <ds:schemaRef ds:uri="http://schemas.microsoft.com/office/infopath/2007/PartnerControls"/>
+    <ds:schemaRef ds:uri="877bdf97-3d41-40e9-8c5f-d7d9b3bdd278"/>
+  </ds:schemaRefs>
+</ds:datastoreItem>
+</file>
+
+<file path=customXml/itemProps3.xml><?xml version="1.0" encoding="utf-8"?>
+<ds:datastoreItem xmlns:ds="http://schemas.openxmlformats.org/officeDocument/2006/customXml" ds:itemID="{9AF87659-D2EC-4420-869D-1D0C0832C419}">
+  <ds:schemaRefs>
+    <ds:schemaRef ds:uri="http://schemas.microsoft.com/sharepoint/v3/contenttype/forms"/>
+  </ds:schemaRefs>
+</ds:datastoreItem>
+</file>
+
+<file path=customXml/itemProps4.xml><?xml version="1.0" encoding="utf-8"?>
 <ds:datastoreItem xmlns:ds="http://schemas.openxmlformats.org/officeDocument/2006/customXml" ds:itemID="{5A280F12-4D55-4B83-B1D2-005AA14E2850}">
   <ds:schemaRefs>
     <ds:schemaRef ds:uri="http://schemas.microsoft.com/office/2006/metadata/contentType"/>
@@ -19011,22 +19433,4 @@
     <ds:schemaRef ds:uri="http://schemas.microsoft.com/internal/obd"/>
   </ds:schemaRefs>
 </ds:datastoreItem>
-</file>
-
-<file path=customXml/itemProps3.xml><?xml version="1.0" encoding="utf-8"?>
-<ds:datastoreItem xmlns:ds="http://schemas.openxmlformats.org/officeDocument/2006/customXml" ds:itemID="{9AF87659-D2EC-4420-869D-1D0C0832C419}">
-  <ds:schemaRefs>
-    <ds:schemaRef ds:uri="http://schemas.microsoft.com/sharepoint/v3/contenttype/forms"/>
-  </ds:schemaRefs>
-</ds:datastoreItem>
-</file>
-
-<file path=customXml/itemProps4.xml><?xml version="1.0" encoding="utf-8"?>
-<ds:datastoreItem xmlns:ds="http://schemas.openxmlformats.org/officeDocument/2006/customXml" ds:itemID="{E8C558B8-7F08-4E37-A8FA-E88348FD1BA6}">
-  <ds:schemaRefs>
-    <ds:schemaRef ds:uri="http://schemas.microsoft.com/office/2006/metadata/properties"/>
-    <ds:schemaRef ds:uri="http://schemas.microsoft.com/office/infopath/2007/PartnerControls"/>
-    <ds:schemaRef ds:uri="877bdf97-3d41-40e9-8c5f-d7d9b3bdd278"/>
-  </ds:schemaRefs>
-</ds:datastoreItem>
 </file>
</xml_diff>